<commit_message>
Add in-text citations and replace references with 10 sources
Co-Authored-By: Claude Sonnet 5.5 <noreply@anthropic.com>
Claude-Session: https://claude.ai/code/session_01BfWNAo3rPJrP7vU7fTtPF2
</commit_message>
<xml_diff>
--- a/SWG_Network_Report.docx
+++ b/SWG_Network_Report.docx
@@ -53,7 +53,7 @@
         <w:spacing w:after="120"/>
       </w:pPr>
       <w:r>
-        <w:t>A-i Method. I ordered the requirements largest first and sized each with 2ⁿ − 2 ≥ hosts. I then allocated sequentially from the 0th subnet, as the brief requires. No subnet calculator was used; the binary working is in the worksheet. Sales (30 hosts) needs 5 host bits, so a /27 (255.255.255.224). IT (17 hosts) also needs 5 bits, because a /28 gives only 14 usable addresses and cannot hold 17. HR (8 hosts) needs 4 bits, so a /28. Each router link needs two addresses, so a /30. Fig. 2 shows the allocation. I chose VLSM over fixed-length subnetting because the departments differ in size, and it lets the block be divided on host needs rather than in equal parts (Pummill and Manning, 1995; Odom, 2019).</w:t>
+        <w:t>A-i Method. I ordered the requirements largest first and sized each with 2ⁿ − 2 ≥ hosts (Odom, 2019). I then allocated sequentially from the 0th subnet, as the brief requires (Pummill and Manning, 1995). No subnet calculator was used; the binary working is in the worksheet. Sales (30 hosts) needs 5 host bits, so a /27 (255.255.255.224). IT (17 hosts) also needs 5 bits, because a /28 gives only 14 usable addresses and cannot hold 17. HR (8 hosts) needs 4 bits, so a /28. Each router link needs two addresses, so a /30. Fig. 2 shows the allocation. I chose VLSM over fixed-length subnetting because the departments differ in size, and it lets the block be divided on host needs rather than in equal parts (Pummill and Manning, 1995; Kurose and Ross, 2021).</w:t>
       </w:r>
     </w:p>
     <w:tbl>
@@ -480,7 +480,7 @@
         <w:spacing w:after="120"/>
       </w:pPr>
       <w:r>
-        <w:t>Limitations. The design leaves almost no room to grow. Sales has 30 usable addresses, but the gateway takes .1, so only 29 remain, one short of the 30 required. A /26 for Sales would fix that, but it will not fit in this /24 beside everything else, so the real remedy is a larger parent block. Also, the departments are grouped by type, not by site, so the space cannot be summarised into one route per site and OSPF carries every subnet individually. A layout by site (for example a /26 per site) would allow one summary per router. Finally, 192.70.20.0/24 is public address space, not RFC 1918 private space (Rekhter et al., 1996). That is acceptable in an isolated lab but would need justifying in production.</w:t>
+        <w:t>Limitations. The design leaves almost no room to grow. Sales has 30 usable addresses, but the gateway takes .1, so only 29 remain, one short of the 30 required. A /26 for Sales would fix that, but it will not fit in this /24 beside everything else, so the real remedy is a larger parent block. Also, the departments are grouped by type, not by site, so the space cannot be summarised into one route per site and OSPF carries every subnet individually; summarisation at area borders is how OSPF keeps routing tables small (Moy, 1998). A layout by site (for example a /26 per site) would allow one summary per router. Finally, 192.70.20.0/24 is public address space, not RFC 1918 private space (Rekhter et al., 1996). That is acceptable in an isolated lab but would need justifying in production.</w:t>
       </w:r>
     </w:p>
     <w:p>
@@ -496,7 +496,7 @@
         <w:spacing w:after="120"/>
       </w:pPr>
       <w:r>
-        <w:t>B-i Design choice. Each site is a star: end devices connect to a switch, and the switch connects to the site router through trunk port Fa0/1 (Fig. 1). The three routers are joined by serial links in a triangle: Skipton–Wrocław 192.70.20.240/30, Skipton–Greenwich .244/30 and Wrocław–Greenwich .248/30. This matches the triangle in the brief.</w:t>
+        <w:t>B-i Design choice. Each site is a star: end devices connect to a switch, and the switch connects to the site router through trunk port Fa0/1, which carries tagged VLAN frames using IEEE 802.1Q (IEEE, 2018) (Fig. 1). The three routers are joined by serial links in a triangle: Skipton–Wrocław 192.70.20.240/30, Skipton–Greenwich .244/30 and Wrocław–Greenwich .248/30. This matches the triangle in the brief.</w:t>
       </w:r>
     </w:p>
     <w:p>
@@ -512,7 +512,7 @@
         <w:spacing w:after="120"/>
       </w:pPr>
       <w:r>
-        <w:t>B-ii Efficiency and resilience. Wrocław–Greenwich traffic uses the direct /30 and does not hairpin through Skipton. OSPF (process 1, area 0) has FULL adjacencies on every link: Wroclaw and Greenwich each list two neighbours (Fig. 4). If one link fails, OSPF reroutes through the third router, and section D tests this. Inside each site PVST+ prevents Layer 2 loops. With one switch per site it is a safeguard rather than an active feature.</w:t>
+        <w:t>B-ii Efficiency and resilience. Wrocław–Greenwich traffic uses the direct /30 and does not hairpin through Skipton. OSPF (process 1, area 0), a link-state protocol that picks the lowest-cost path (Moy, 1998), has FULL adjacencies on every link: Wroclaw and Greenwich each list two neighbours (Fig. 4). If one link fails, OSPF reroutes through the third router, and section D tests this. Inside each site PVST+ prevents Layer 2 loops (Odom, 2019). With one switch per site it is a safeguard rather than an active feature.</w:t>
       </w:r>
     </w:p>
     <w:p>
@@ -520,7 +520,7 @@
         <w:spacing w:after="120"/>
       </w:pPr>
       <w:r>
-        <w:t>Inter-VLAN routing is router-on-a-stick. Skipton has sub-interfaces Gi0/0.10 (VLAN 10, 192.70.20.1), Gi0/0.20 (VLAN 20, .97) and Gi0/0.30 (VLAN 30, .193), as Fig. 4 shows. The limitation is that all three VLANs share one physical link, and each site still has a single router, switch and trunk, so a failure there isolates the site. A Layer 3 switch or a second uplink would remove that.</w:t>
+        <w:t>Inter-VLAN routing is router-on-a-stick, with one 802.1Q sub-interface per VLAN (Odom, 2019). Skipton has sub-interfaces Gi0/0.10 (VLAN 10, 192.70.20.1), Gi0/0.20 (VLAN 20, .97) and Gi0/0.30 (VLAN 30, .193), as Fig. 4 shows. The limitation is that all three VLANs share one physical link, and each site still has a single router, switch and trunk, so a failure there isolates the site. A Layer 3 switch or a second uplink would remove that.</w:t>
       </w:r>
     </w:p>
     <w:p>
@@ -536,7 +536,7 @@
         <w:spacing w:after="120"/>
       </w:pPr>
       <w:r>
-        <w:t>C-i Controls and reasons. On the routers (Fig. 5) I set an enable secret, console and VTY passwords with login, a MOTD warning banner and service password-encryption. The enable secret is stored as an MD5 hash, so a copied config does not reveal it. Service password-encryption only applies weak type 7 encoding to the line passwords. It stops shoulder-surfing, not a determined attacker. The banner gives a legal warning to anyone logging in. This matters for SWG because the routers carry all inter-site and inter-VLAN traffic, so control of one router would expose every department. VLANs 10, 20 and 30 split each site into separate broadcast domains.</w:t>
+        <w:t>C-i Controls and reasons. On the routers (Fig. 5) I set an enable secret, console and VTY passwords with login, a MOTD warning banner and service password-encryption. The enable secret is stored as an MD5 hash, so a copied config does not reveal it (Odom, 2019). Service password-encryption only applies weak type 7 encoding to the line passwords. It stops shoulder-surfing, not a determined attacker. The banner gives a legal warning to anyone logging in. This matters for SWG because the routers carry all inter-site and inter-VLAN traffic, so control of one router would expose every department. VLANs 10, 20 and 30 split each site into separate broadcast domains.</w:t>
       </w:r>
     </w:p>
     <w:p>
@@ -544,7 +544,7 @@
         <w:spacing w:after="120"/>
       </w:pPr>
       <w:r>
-        <w:t>Port security on the access ports uses sticky MAC learning, a maximum of 2 and violation mode restrict (Fig. 6). This limits MAC flooding and rogue devices. I chose restrict over shutdown because shutdown puts the port into err-disabled and needs an administrator to recover it, so one mistake could lock out a legitimate user. The cost is that the port stays up during an attack, so shutdown would suit sensitive ports better. At Wrocław, WPA2-PSK on the SSID “Smartphone” requires a passphrase before a device can join. The weakness is that every user shares one key, so removing a single user means changing it for everyone, and WPA2-Enterprise would be the better choice at scale.</w:t>
+        <w:t>Port security on the access ports uses sticky MAC learning, a maximum of 2 and violation mode restrict (Fig. 6). This limits MAC flooding and rogue devices (Odom, 2019). I chose restrict over shutdown because shutdown puts the port into err-disabled and needs an administrator to recover it, so one mistake could lock out a legitimate user. The cost is that the port stays up during an attack, so shutdown would suit sensitive ports better. At Wrocław, WPA2-PSK on the SSID “Smartphone” requires a passphrase before a device can join. The weakness is that every user shares one key, so removing a single user means changing it for everyone, and WPA2-Enterprise would be the better choice at scale.</w:t>
       </w:r>
     </w:p>
     <w:p>
@@ -552,7 +552,7 @@
         <w:spacing w:after="120"/>
       </w:pPr>
       <w:r>
-        <w:t>Honest limits. The VLANs are segmentation, not isolation: inter-VLAN routing is on and I configured no ACLs, so Sales can still reach HR. The switch configurations do not have service password-encryption enabled. The brief mandates Telnet, which sends passwords in clear text, and the passwords it supplies are weak, so this suits a lab only.</w:t>
+        <w:t>Honest limits. The VLANs are segmentation, not isolation: inter-VLAN routing is on and I configured no ACLs, so Sales can still reach HR. The switch configurations do not have service password-encryption enabled. The brief mandates Telnet, which sends passwords in clear text (Postel and Reynolds, 1983), and the passwords it supplies are weak, so this suits a lab only.</w:t>
       </w:r>
     </w:p>
     <w:p>
@@ -585,7 +585,7 @@
         <w:t>PC__ and the Greenwich router: state your substitutes</w:t>
       </w:r>
       <w:r>
-        <w:t xml:space="preserve"> as the nearest real devices. In the ping tests (Fig. 8) the first run showed 75% success (3 of 4 replies). The first request waits for ARP to resolve the gateway, and later pings reached 100%. Replies from other sites came back with TTL </w:t>
+        <w:t xml:space="preserve"> as the nearest real devices. In the ping tests (Fig. 8) the first run showed 75% success (3 of 4 replies). The first request waits for ARP to resolve the gateway (Plummer, 1982), and later pings reached 100%. Replies from other sites came back with TTL </w:t>
       </w:r>
       <w:r>
         <w:rPr>
@@ -611,7 +611,7 @@
         <w:spacing w:after="120"/>
       </w:pPr>
       <w:r>
-        <w:t xml:space="preserve">Traceroute shows the ingress address of each router. PC70 to Laptop77 (Wrocław Sales to IT) showed 192.70.20.33 and then the destination, two hops, because the Wroclaw router routes between VLANs. PC01 to PC100 (Skipton HR to Greenwich Sales) showed 192.70.20.193, then 192.70.20.246, the Greenwich end of the direct link, then the destination </w:t>
+        <w:t xml:space="preserve">Traceroute shows the ingress address of each router, so each hop is one routed step (Kurose and Ross, 2021). PC70 to Laptop77 (Wrocław Sales to IT) showed 192.70.20.33 and then the destination, two hops, because the Wroclaw router routes between VLANs. PC01 to PC100 (Skipton HR to Greenwich Sales) showed 192.70.20.193, then 192.70.20.246, the Greenwich end of the direct link, then the destination </w:t>
       </w:r>
       <w:r>
         <w:rPr>
@@ -694,7 +694,7 @@
         <w:spacing w:after="120"/>
       </w:pPr>
       <w:r>
-        <w:t>Critical limits. Skipton hosts both DNS and HTTP, so a Skipton failure removes name resolution for every site. Each site has one router and one switch, and the addressing leaves almost no growth room. The result is a network that is easy to document but not yet fault tolerant at site level. Next I would add a second DNS server at a branch, redundant uplinks and a first-hop redundancy protocol such as HSRP, and plan a larger addressing block laid out by site.</w:t>
+        <w:t>Critical limits. Skipton hosts both DNS and HTTP, so a Skipton failure removes name resolution for every site. Each site has one router and one switch, and the addressing leaves almost no growth room. The result is a network that is easy to document but not yet fault tolerant at site level. Next I would add a second DNS server at a branch, redundant uplinks and a first-hop redundancy protocol such as HSRP (Odom, 2019), and plan a larger addressing block laid out by site.</w:t>
       </w:r>
     </w:p>
     <w:p>
@@ -1385,7 +1385,7 @@
         <w:spacing w:after="120"/>
       </w:pPr>
       <w:r>
-        <w:t>Cisco (n.d.) VLAN Configuration Guide: Configure VLAN Trunking. Available at: https://www.cisco.com/c/en/us/td/docs/switches/lan/c9000/lyr2-fwd/vlan/vlan-configuration-guide/configure-vlan-trunks.html</w:t>
+        <w:t>IEEE (2018) IEEE Std 802.1Q-2018: Bridges and Bridged Networks. New York: IEEE.</w:t>
       </w:r>
     </w:p>
     <w:p>
@@ -1401,7 +1401,7 @@
         <w:spacing w:after="120"/>
       </w:pPr>
       <w:r>
-        <w:t>Kurose, J.F. and Ross, K.W. (2021) Computer Networking: A Top-Down Approach. 8th edn. Pearson.</w:t>
+        <w:t>Kurose, J.F. and Ross, K.W. (2021) Computer Networking: A Top-Down Approach. 8th edn. Harlow: Pearson.</w:t>
       </w:r>
     </w:p>
     <w:p>
@@ -1417,7 +1417,23 @@
         <w:spacing w:after="120"/>
       </w:pPr>
       <w:r>
-        <w:t>Odom, W. (2019) CCNA 200-301 Official Cert Guide. Cisco Press.</w:t>
+        <w:t>Odom, W. (2019) CCNA 200-301 Official Cert Guide, Volume 1. Indianapolis: Cisco Press.</w:t>
+      </w:r>
+    </w:p>
+    <w:p>
+      <w:pPr>
+        <w:spacing w:after="120"/>
+      </w:pPr>
+      <w:r>
+        <w:t>Plummer, D. (1982) RFC 826: An Ethernet Address Resolution Protocol. IETF.</w:t>
+      </w:r>
+    </w:p>
+    <w:p>
+      <w:pPr>
+        <w:spacing w:after="120"/>
+      </w:pPr>
+      <w:r>
+        <w:t>Postel, J. and Reynolds, J. (1983) RFC 854: Telnet Protocol Specification. IETF.</w:t>
       </w:r>
     </w:p>
     <w:p>

</xml_diff>

<commit_message>
Update fault tolerance test section
Co-Authored-By: Claude Sonnet 5.5 <noreply@anthropic.com>
Claude-Session: https://claude.ai/code/session_01BfWNAo3rPJrP7vU7fTtPF2
</commit_message>
<xml_diff>
--- a/SWG_Network_Report.docx
+++ b/SWG_Network_Report.docx
@@ -653,16 +653,7 @@
         <w:spacing w:after="120"/>
       </w:pPr>
       <w:r>
-        <w:t xml:space="preserve">Fault test. I shut Serial0/1/1 on Skipton and repeated the PC01 to PC100 traceroute. The path lengthened to 192.70.20.193, then 192.70.20.242 (Wrocław), then 192.70.20.250 (Greenwich), then the destination </w:t>
-      </w:r>
-      <w:r>
-        <w:rPr>
-          <w:highlight w:val="yellow"/>
-        </w:rPr>
-        <w:t>confirm against your output</w:t>
-      </w:r>
-      <w:r>
-        <w:t>, and pings still succeeded (Fig. 9). The extra hop is the cost of the reroute, and the test proves the resilience claimed in B.</w:t>
+        <w:t>Fault tolerance test. To test resilience, I shut down Serial0/1/1 on the Skipton router and repeated the traceroute from PC01 to PC100. The route changed and passed through 192.70.20.193 (Skipton HR gateway), 192.70.20.242 (Wrocław serial interface) and 192.70.20.250 (Greenwich serial interface) before reaching the destination, one hop more than the direct path. The ping still succeeded, so PC01 could reach PC100 with the direct link down (Fig. 9). OSPF removed the failed route and selected the alternative through the other routers (Moy, 1998). The cost is a longer path and higher latency, but connectivity is kept, which proves the resilience claimed in B. It tests one link failure only: a second failure, or the loss of the Wroclaw router, would still isolate a site.</w:t>
       </w:r>
     </w:p>
     <w:p>
@@ -1337,7 +1328,7 @@
         <w:rPr>
           <w:highlight w:val="yellow"/>
         </w:rPr>
-        <w:t>Fig. 9: insert traceroute before and after the link-shutdown test.</w:t>
+        <w:t>Fig. 9: insert the traceroute and successful ping captured with Serial0/1/1 shut down, plus the earlier direct-path traceroute for comparison.</w:t>
       </w:r>
       <w:r/>
     </w:p>

</xml_diff>

<commit_message>
Align report with worksheet (router mapping, serial names)
Co-Authored-By: Claude Sonnet 5.5 <noreply@anthropic.com>
Claude-Session: https://claude.ai/code/session_01BfWNAo3rPJrP7vU7fTtPF2
</commit_message>
<xml_diff>
--- a/SWG_Network_Report.docx
+++ b/SWG_Network_Report.docx
@@ -28,16 +28,7 @@
         <w:spacing w:after="120"/>
       </w:pPr>
       <w:r>
-        <w:t xml:space="preserve">SWG Technologies needs one network joining its Skipton (head office), Wrocław and Greenwich sites. This report documents the design I built in Packet Tracer from the single block 192.70.20.0/24. Each site has one 1941 router and one 2960 switch, named Skipton, Wroclaw and Greenwich (Router0, Router1 and Router2 in the brief </w:t>
-      </w:r>
-      <w:r>
-        <w:rPr>
-          <w:highlight w:val="yellow"/>
-        </w:rPr>
-        <w:t>confirm this mapping against your .pkt</w:t>
-      </w:r>
-      <w:r>
-        <w:t>). I cover addressing (A), topology (B), security (C), testing (D) and reliability (E). Each section gives a claim, the evidence for it, and its limits.</w:t>
+        <w:t>SWG Technologies needs one network joining its Skipton (head office), Wrocław and Greenwich sites. This report documents the design I built in Packet Tracer from the single block 192.70.20.0/24. Each site has one 1941 router and one 2960 switch, named Skipton, Wroclaw and Greenwich (Router0, Router1 and Router2 in the brief and worksheet). I cover addressing (A), topology (B), security (C), testing (D) and reliability (E). Each section gives a claim, the evidence for it, and its limits.</w:t>
       </w:r>
     </w:p>
     <w:p>
@@ -496,7 +487,7 @@
         <w:spacing w:after="120"/>
       </w:pPr>
       <w:r>
-        <w:t>B-i Design choice. Each site is a star: end devices connect to a switch, and the switch connects to the site router through trunk port Fa0/1, which carries tagged VLAN frames using IEEE 802.1Q (IEEE, 2018) (Fig. 1). The three routers are joined by serial links in a triangle: Skipton–Wrocław 192.70.20.240/30, Skipton–Greenwich .244/30 and Wrocław–Greenwich .248/30. This matches the triangle in the brief.</w:t>
+        <w:t>B-i Design choice. Each site is a star: end devices connect to a switch, and the switch connects to the site router through trunk port Fa0/1, which carries tagged VLAN frames using IEEE 802.1Q (IEEE, 2018) (Fig. 1). The three routers are joined by serial links in a triangle: Skipton–Wrocław 192.70.20.240/30, Skipton–Greenwich .244/30 and Wrocław–Greenwich .248/30. This matches the triangle in the brief. The worksheet lists these links as Se0/0/0 and Se0/0/1, but my routers’ serial ports are Serial0/1/0 and Serial0/1/1, so I applied each address to the interface actually cabled to that neighbour.</w:t>
       </w:r>
     </w:p>
     <w:p>

</xml_diff>

<commit_message>
Add ping and traceroute evidence to report
Co-Authored-By: Claude Sonnet 5.5 <noreply@anthropic.com>
Claude-Session: https://claude.ai/code/session_01BfWNAo3rPJrP7vU7fTtPF2
</commit_message>
<xml_diff>
--- a/SWG_Network_Report.docx
+++ b/SWG_Network_Report.docx
@@ -576,25 +576,16 @@
         <w:t>PC__ and the Greenwich router: state your substitutes</w:t>
       </w:r>
       <w:r>
-        <w:t xml:space="preserve"> as the nearest real devices. In the ping tests (Fig. 8) the first run showed 75% success (3 of 4 replies). The first request waits for ARP to resolve the gateway (Plummer, 1982), and later pings reached 100%. Replies from other sites came back with TTL </w:t>
+        <w:t xml:space="preserve"> as the nearest real devices. In Fig. 8 the DNS server pinged its gateway, 192.70.20.97, and all four replies arrived (0% loss). The TTL of 255 shows the reply came straight from the router’s own interface with no hops between, and the times were under 1 ms except one at 7 ms. A first request can time out while ARP resolves the gateway’s MAC address (Plummer, 1982). That did not happen here, so the entry was probably already cached. </w:t>
       </w:r>
       <w:r>
         <w:rPr>
           <w:highlight w:val="yellow"/>
         </w:rPr>
-        <w:t>__</w:t>
+        <w:t>Add the other worksheet pings to Fig. 8 and quote their results.</w:t>
       </w:r>
       <w:r>
-        <w:t xml:space="preserve"> and round-trip times of </w:t>
-      </w:r>
-      <w:r>
-        <w:rPr>
-          <w:highlight w:val="yellow"/>
-        </w:rPr>
-        <w:t>__ ms</w:t>
-      </w:r>
-      <w:r>
-        <w:t>, consistent with crossing one or two serial hops. These results support the addressing in A.</w:t>
+        <w:t xml:space="preserve"> These results support the addressing in A.</w:t>
       </w:r>
     </w:p>
     <w:p>
@@ -602,16 +593,7 @@
         <w:spacing w:after="120"/>
       </w:pPr>
       <w:r>
-        <w:t xml:space="preserve">Traceroute shows the ingress address of each router, so each hop is one routed step (Kurose and Ross, 2021). PC70 to Laptop77 (Wrocław Sales to IT) showed 192.70.20.33 and then the destination, two hops, because the Wroclaw router routes between VLANs. PC01 to PC100 (Skipton HR to Greenwich Sales) showed 192.70.20.193, then 192.70.20.246, the Greenwich end of the direct link, then the destination </w:t>
-      </w:r>
-      <w:r>
-        <w:rPr>
-          <w:highlight w:val="yellow"/>
-        </w:rPr>
-        <w:t>confirm against your output</w:t>
-      </w:r>
-      <w:r>
-        <w:t xml:space="preserve">. This shows OSPF chose the direct path and not the longer one through Wrocław, which supports B-ii. PC73 to PC01 (Wrocław to Skipton) showed 192.70.20.33, then 192.70.20.241, then the destination, and PC02 to PC08 (Skipton HR to IT) showed 192.70.20.193 and then the destination </w:t>
+        <w:t xml:space="preserve">Traceroute shows the ingress address of each router, so each hop is one routed step (Kurose and Ross, 2021). PC70 to Laptop77 (Wrocław Sales to IT) showed 192.70.20.33 and then the destination, two hops, because the Wroclaw router routes between VLANs. PC01 to PC100 (Skipton HR to Greenwich Sales) showed 192.70.20.193, then 192.70.20.246, the Greenwich end of the direct link, then the destination (Fig. 9). The single timeout (*) on the first probe of the last hop is the same ARP delay, this time at the Greenwich router, and the following probes replied in under 1 ms. This shows OSPF chose the direct path and not the longer one through Wrocław, which supports B-ii. PC73 to PC01 (Wrocław to Skipton) showed 192.70.20.33, then 192.70.20.241, then the destination, and PC02 to PC08 (Skipton HR to IT) showed 192.70.20.193 and then the destination </w:t>
       </w:r>
       <w:r>
         <w:rPr>
@@ -644,7 +626,7 @@
         <w:spacing w:after="120"/>
       </w:pPr>
       <w:r>
-        <w:t>Fault tolerance test. To test resilience, I shut down Serial0/1/1 on the Skipton router and repeated the traceroute from PC01 to PC100. The route changed and passed through 192.70.20.193 (Skipton HR gateway), 192.70.20.242 (Wrocław serial interface) and 192.70.20.250 (Greenwich serial interface) before reaching the destination, one hop more than the direct path. The ping still succeeded, so PC01 could reach PC100 with the direct link down (Fig. 9). OSPF removed the failed route and selected the alternative through the other routers (Moy, 1998). The cost is a longer path and higher latency, but connectivity is kept, which proves the resilience claimed in B. It tests one link failure only: a second failure, or the loss of the Wroclaw router, would still isolate a site.</w:t>
+        <w:t>Fault tolerance test. To test resilience, I shut down Serial0/1/1 on the Skipton router and repeated the traceroute from PC01 to PC100. The route changed and passed through 192.70.20.193 (Skipton HR gateway), 192.70.20.242 (Wrocław serial interface) and 192.70.20.250 (Greenwich serial interface) before reaching the destination, one hop more than the direct path. The ping still succeeded, so PC01 could reach PC100 with the direct link down (Fig. 10). OSPF removed the failed route and selected the alternative through the other routers (Moy, 1998). The cost is a longer path and higher latency, but connectivity is kept, which proves the resilience claimed in B. It tests one link failure only: a second failure, or the loss of the Wroclaw router, would still isolate a site.</w:t>
       </w:r>
     </w:p>
     <w:p>
@@ -1298,17 +1280,100 @@
       </w:r>
     </w:p>
     <w:p>
+      <w:r>
+        <w:drawing>
+          <wp:inline xmlns:a="http://schemas.openxmlformats.org/drawingml/2006/main" xmlns:pic="http://schemas.openxmlformats.org/drawingml/2006/picture">
+            <wp:extent cx="3240000" cy="2029975"/>
+            <wp:docPr id="12" name="Picture 12"/>
+            <wp:cNvGraphicFramePr>
+              <a:graphicFrameLocks noChangeAspect="1"/>
+            </wp:cNvGraphicFramePr>
+            <a:graphic>
+              <a:graphicData uri="http://schemas.openxmlformats.org/drawingml/2006/picture">
+                <pic:pic>
+                  <pic:nvPicPr>
+                    <pic:cNvPr id="0" name="2.png"/>
+                    <pic:cNvPicPr/>
+                  </pic:nvPicPr>
+                  <pic:blipFill>
+                    <a:blip r:embed="rId20"/>
+                    <a:stretch>
+                      <a:fillRect/>
+                    </a:stretch>
+                  </pic:blipFill>
+                  <pic:spPr>
+                    <a:xfrm>
+                      <a:off x="0" y="0"/>
+                      <a:ext cx="3240000" cy="2029975"/>
+                    </a:xfrm>
+                    <a:prstGeom prst="rect"/>
+                  </pic:spPr>
+                </pic:pic>
+              </a:graphicData>
+            </a:graphic>
+          </wp:inline>
+        </w:drawing>
+      </w:r>
+    </w:p>
+    <w:p>
       <w:pPr>
-        <w:spacing w:after="120"/>
+        <w:jc w:val="center"/>
       </w:pPr>
-      <w:r/>
       <w:r>
         <w:rPr>
-          <w:highlight w:val="yellow"/>
+          <w:i/>
+          <w:sz w:val="19"/>
         </w:rPr>
-        <w:t>Fig. 8: insert two ping outputs (command and output together).</w:t>
+        <w:t>Fig. 8: Ping from the DNS server to its gateway 192.70.20.97 (4 of 4 replies, TTL 255).</w:t>
       </w:r>
-      <w:r/>
+    </w:p>
+    <w:p>
+      <w:r>
+        <w:drawing>
+          <wp:inline xmlns:a="http://schemas.openxmlformats.org/drawingml/2006/main" xmlns:pic="http://schemas.openxmlformats.org/drawingml/2006/picture">
+            <wp:extent cx="3240000" cy="1436453"/>
+            <wp:docPr id="13" name="Picture 13"/>
+            <wp:cNvGraphicFramePr>
+              <a:graphicFrameLocks noChangeAspect="1"/>
+            </wp:cNvGraphicFramePr>
+            <a:graphic>
+              <a:graphicData uri="http://schemas.openxmlformats.org/drawingml/2006/picture">
+                <pic:pic>
+                  <pic:nvPicPr>
+                    <pic:cNvPr id="0" name="1.png"/>
+                    <pic:cNvPicPr/>
+                  </pic:nvPicPr>
+                  <pic:blipFill>
+                    <a:blip r:embed="rId21"/>
+                    <a:stretch>
+                      <a:fillRect/>
+                    </a:stretch>
+                  </pic:blipFill>
+                  <pic:spPr>
+                    <a:xfrm>
+                      <a:off x="0" y="0"/>
+                      <a:ext cx="3240000" cy="1436453"/>
+                    </a:xfrm>
+                    <a:prstGeom prst="rect"/>
+                  </pic:spPr>
+                </pic:pic>
+              </a:graphicData>
+            </a:graphic>
+          </wp:inline>
+        </w:drawing>
+      </w:r>
+    </w:p>
+    <w:p>
+      <w:pPr>
+        <w:jc w:val="center"/>
+      </w:pPr>
+      <w:r>
+        <w:rPr>
+          <w:i/>
+          <w:sz w:val="19"/>
+        </w:rPr>
+        <w:t>Fig. 9: Traceroute from PC01 to PC100 (192.70.20.66) on the direct path: gateway .193, Greenwich link end .246, destination.</w:t>
+      </w:r>
     </w:p>
     <w:p>
       <w:pPr>
@@ -1319,7 +1384,7 @@
         <w:rPr>
           <w:highlight w:val="yellow"/>
         </w:rPr>
-        <w:t>Fig. 9: insert the traceroute and successful ping captured with Serial0/1/1 shut down, plus the earlier direct-path traceroute for comparison.</w:t>
+        <w:t>Fig. 10: insert the traceroute and successful ping captured with Serial0/1/1 shut down.</w:t>
       </w:r>
       <w:r/>
     </w:p>

</xml_diff>

<commit_message>
Add cross-site ping to Fig. 8
Co-Authored-By: Claude Sonnet 5.5 <noreply@anthropic.com>
Claude-Session: https://claude.ai/code/session_01BfWNAo3rPJrP7vU7fTtPF2
</commit_message>
<xml_diff>
--- a/SWG_Network_Report.docx
+++ b/SWG_Network_Report.docx
@@ -576,13 +576,13 @@
         <w:t>PC__ and the Greenwich router: state your substitutes</w:t>
       </w:r>
       <w:r>
-        <w:t xml:space="preserve"> as the nearest real devices. In Fig. 8 the DNS server pinged its gateway, 192.70.20.97, and all four replies arrived (0% loss). The TTL of 255 shows the reply came straight from the router’s own interface with no hops between, and the times were under 1 ms except one at 7 ms. A first request can time out while ARP resolves the gateway’s MAC address (Plummer, 1982). That did not happen here, so the entry was probably already cached. </w:t>
+        <w:t xml:space="preserve"> as the nearest real devices. In Fig. 8 the DNS server pinged its gateway, 192.70.20.97, and all four replies arrived (0% loss). The TTL of 255 shows the reply came straight from the router’s own interface with no hops between, and the times were under 1 ms except one at 7 ms. A first request can time out while ARP resolves the gateway’s MAC address (Plummer, 1982). That did not happen here, so the entry was probably already cached. A cross-site ping from PC01 to PC100 also succeeded, with 4 of 4 replies and 0% loss. The times were 19, 37, 2 and 1 ms: the slow first replies are the ARP and first-packet delay, and later replies settled at 1 to 2 ms. The TTL of 126 is the PC’s starting value of 128 minus two routers (Skipton and Greenwich), which confirms the direct two-router path. </w:t>
       </w:r>
       <w:r>
         <w:rPr>
           <w:highlight w:val="yellow"/>
         </w:rPr>
-        <w:t>Add the other worksheet pings to Fig. 8 and quote their results.</w:t>
+        <w:t>Add the remaining worksheet pings.</w:t>
       </w:r>
       <w:r>
         <w:t xml:space="preserve"> These results support the addressing in A.</w:t>
@@ -1279,42 +1279,106 @@
         <w:t>Fig. 7: DNS A record on the DNS server (left); PC18 loading www.coventrylab.ac.uk (right).</w:t>
       </w:r>
     </w:p>
-    <w:p>
-      <w:r>
-        <w:drawing>
-          <wp:inline xmlns:a="http://schemas.openxmlformats.org/drawingml/2006/main" xmlns:pic="http://schemas.openxmlformats.org/drawingml/2006/picture">
-            <wp:extent cx="3240000" cy="2029975"/>
-            <wp:docPr id="12" name="Picture 12"/>
-            <wp:cNvGraphicFramePr>
-              <a:graphicFrameLocks noChangeAspect="1"/>
-            </wp:cNvGraphicFramePr>
-            <a:graphic>
-              <a:graphicData uri="http://schemas.openxmlformats.org/drawingml/2006/picture">
-                <pic:pic>
-                  <pic:nvPicPr>
-                    <pic:cNvPr id="0" name="2.png"/>
-                    <pic:cNvPicPr/>
-                  </pic:nvPicPr>
-                  <pic:blipFill>
-                    <a:blip r:embed="rId20"/>
-                    <a:stretch>
-                      <a:fillRect/>
-                    </a:stretch>
-                  </pic:blipFill>
-                  <pic:spPr>
-                    <a:xfrm>
-                      <a:off x="0" y="0"/>
-                      <a:ext cx="3240000" cy="2029975"/>
-                    </a:xfrm>
-                    <a:prstGeom prst="rect"/>
-                  </pic:spPr>
-                </pic:pic>
-              </a:graphicData>
-            </a:graphic>
-          </wp:inline>
-        </w:drawing>
-      </w:r>
-    </w:p>
+    <w:tbl>
+      <w:tblPr>
+        <w:tblW w:type="auto" w:w="0"/>
+        <w:tblLook w:firstColumn="1" w:firstRow="1" w:lastColumn="0" w:lastRow="0" w:noHBand="0" w:noVBand="1" w:val="04A0"/>
+      </w:tblPr>
+      <w:tblGrid>
+        <w:gridCol w:w="4873"/>
+        <w:gridCol w:w="4873"/>
+      </w:tblGrid>
+      <w:tr>
+        <w:tc>
+          <w:tcPr>
+            <w:tcW w:type="dxa" w:w="4873"/>
+          </w:tcPr>
+          <w:p>
+            <w:pPr>
+              <w:jc w:val="center"/>
+            </w:pPr>
+            <w:r>
+              <w:drawing>
+                <wp:inline xmlns:a="http://schemas.openxmlformats.org/drawingml/2006/main" xmlns:pic="http://schemas.openxmlformats.org/drawingml/2006/picture">
+                  <wp:extent cx="2880000" cy="1804423"/>
+                  <wp:docPr id="12" name="Picture 12"/>
+                  <wp:cNvGraphicFramePr>
+                    <a:graphicFrameLocks noChangeAspect="1"/>
+                  </wp:cNvGraphicFramePr>
+                  <a:graphic>
+                    <a:graphicData uri="http://schemas.openxmlformats.org/drawingml/2006/picture">
+                      <pic:pic>
+                        <pic:nvPicPr>
+                          <pic:cNvPr id="0" name="2.png"/>
+                          <pic:cNvPicPr/>
+                        </pic:nvPicPr>
+                        <pic:blipFill>
+                          <a:blip r:embed="rId20"/>
+                          <a:stretch>
+                            <a:fillRect/>
+                          </a:stretch>
+                        </pic:blipFill>
+                        <pic:spPr>
+                          <a:xfrm>
+                            <a:off x="0" y="0"/>
+                            <a:ext cx="2880000" cy="1804423"/>
+                          </a:xfrm>
+                          <a:prstGeom prst="rect"/>
+                        </pic:spPr>
+                      </pic:pic>
+                    </a:graphicData>
+                  </a:graphic>
+                </wp:inline>
+              </w:drawing>
+            </w:r>
+          </w:p>
+        </w:tc>
+        <w:tc>
+          <w:tcPr>
+            <w:tcW w:type="dxa" w:w="4873"/>
+          </w:tcPr>
+          <w:p>
+            <w:pPr>
+              <w:jc w:val="center"/>
+            </w:pPr>
+            <w:r>
+              <w:drawing>
+                <wp:inline xmlns:a="http://schemas.openxmlformats.org/drawingml/2006/main" xmlns:pic="http://schemas.openxmlformats.org/drawingml/2006/picture">
+                  <wp:extent cx="2880000" cy="1587232"/>
+                  <wp:docPr id="13" name="Picture 13"/>
+                  <wp:cNvGraphicFramePr>
+                    <a:graphicFrameLocks noChangeAspect="1"/>
+                  </wp:cNvGraphicFramePr>
+                  <a:graphic>
+                    <a:graphicData uri="http://schemas.openxmlformats.org/drawingml/2006/picture">
+                      <pic:pic>
+                        <pic:nvPicPr>
+                          <pic:cNvPr id="0" name="3.png"/>
+                          <pic:cNvPicPr/>
+                        </pic:nvPicPr>
+                        <pic:blipFill>
+                          <a:blip r:embed="rId21"/>
+                          <a:stretch>
+                            <a:fillRect/>
+                          </a:stretch>
+                        </pic:blipFill>
+                        <pic:spPr>
+                          <a:xfrm>
+                            <a:off x="0" y="0"/>
+                            <a:ext cx="2880000" cy="1587232"/>
+                          </a:xfrm>
+                          <a:prstGeom prst="rect"/>
+                        </pic:spPr>
+                      </pic:pic>
+                    </a:graphicData>
+                  </a:graphic>
+                </wp:inline>
+              </w:drawing>
+            </w:r>
+          </w:p>
+        </w:tc>
+      </w:tr>
+    </w:tbl>
     <w:p>
       <w:pPr>
         <w:jc w:val="center"/>
@@ -1324,7 +1388,7 @@
           <w:i/>
           <w:sz w:val="19"/>
         </w:rPr>
-        <w:t>Fig. 8: Ping from the DNS server to its gateway 192.70.20.97 (4 of 4 replies, TTL 255).</w:t>
+        <w:t>Fig. 8: Ping from the DNS server to its gateway 192.70.20.97 (left, TTL 255); ping from PC01 to PC100 192.70.20.66 (right, TTL 126, 0% loss).</w:t>
       </w:r>
     </w:p>
     <w:p>
@@ -1332,7 +1396,7 @@
         <w:drawing>
           <wp:inline xmlns:a="http://schemas.openxmlformats.org/drawingml/2006/main" xmlns:pic="http://schemas.openxmlformats.org/drawingml/2006/picture">
             <wp:extent cx="3240000" cy="1436453"/>
-            <wp:docPr id="13" name="Picture 13"/>
+            <wp:docPr id="14" name="Picture 14"/>
             <wp:cNvGraphicFramePr>
               <a:graphicFrameLocks noChangeAspect="1"/>
             </wp:cNvGraphicFramePr>
@@ -1344,7 +1408,7 @@
                     <pic:cNvPicPr/>
                   </pic:nvPicPr>
                   <pic:blipFill>
-                    <a:blip r:embed="rId21"/>
+                    <a:blip r:embed="rId22"/>
                     <a:stretch>
                       <a:fillRect/>
                     </a:stretch>

</xml_diff>

<commit_message>
Replace D-i results text
Co-Authored-By: Claude Sonnet 5.5 <noreply@anthropic.com>
Claude-Session: https://claude.ai/code/session_01BfWNAo3rPJrP7vU7fTtPF2
</commit_message>
<xml_diff>
--- a/SWG_Network_Report.docx
+++ b/SWG_Network_Report.docx
@@ -567,25 +567,16 @@
         <w:spacing w:after="120"/>
       </w:pPr>
       <w:r>
-        <w:t xml:space="preserve">D-i Results. I ran the worksheet tests. The brief names “PC20” and “Router3”, which do not exist in my topology, so I used </w:t>
+        <w:t xml:space="preserve">D-i Results. I ran the worksheet ping and traceroute tests using the renamed devices in my Packet Tracer topology. The worksheet refers to PC20 and Router3; I used </w:t>
       </w:r>
       <w:r>
         <w:rPr>
           <w:highlight w:val="yellow"/>
         </w:rPr>
-        <w:t>PC__ and the Greenwich router: state your substitutes</w:t>
+        <w:t>[actual PC name]</w:t>
       </w:r>
       <w:r>
-        <w:t xml:space="preserve"> as the nearest real devices. In Fig. 8 the DNS server pinged its gateway, 192.70.20.97, and all four replies arrived (0% loss). The TTL of 255 shows the reply came straight from the router’s own interface with no hops between, and the times were under 1 ms except one at 7 ms. A first request can time out while ARP resolves the gateway’s MAC address (Plummer, 1982). That did not happen here, so the entry was probably already cached. A cross-site ping from PC01 to PC100 also succeeded, with 4 of 4 replies and 0% loss. The times were 19, 37, 2 and 1 ms: the slow first replies are the ARP and first-packet delay, and later replies settled at 1 to 2 ms. The TTL of 126 is the PC’s starting value of 128 minus two routers (Skipton and Greenwich), which confirms the direct two-router path. </w:t>
-      </w:r>
-      <w:r>
-        <w:rPr>
-          <w:highlight w:val="yellow"/>
-        </w:rPr>
-        <w:t>Add the remaining worksheet pings.</w:t>
-      </w:r>
-      <w:r>
-        <w:t xml:space="preserve"> These results support the addressing in A.</w:t>
+        <w:t xml:space="preserve"> as the substitute for PC20 and the Greenwich router as the substitute for Router3.</w:t>
       </w:r>
     </w:p>
     <w:p>
@@ -593,16 +584,39 @@
         <w:spacing w:after="120"/>
       </w:pPr>
       <w:r>
-        <w:t xml:space="preserve">Traceroute shows the ingress address of each router, so each hop is one routed step (Kurose and Ross, 2021). PC70 to Laptop77 (Wrocław Sales to IT) showed 192.70.20.33 and then the destination, two hops, because the Wroclaw router routes between VLANs. PC01 to PC100 (Skipton HR to Greenwich Sales) showed 192.70.20.193, then 192.70.20.246, the Greenwich end of the direct link, then the destination (Fig. 9). The single timeout (*) on the first probe of the last hop is the same ARP delay, this time at the Greenwich router, and the following probes replied in under 1 ms. This shows OSPF chose the direct path and not the longer one through Wrocław, which supports B-ii. PC73 to PC01 (Wrocław to Skipton) showed 192.70.20.33, then 192.70.20.241, then the destination, and PC02 to PC08 (Skipton HR to IT) showed 192.70.20.193 and then the destination </w:t>
+        <w:t>In Fig. 8, the DNS server successfully pinged its gateway, 192.70.20.97, receiving all four replies with 0% packet loss. The TTL of 255 is consistent with a response from the router’s directly connected interface. The response times were below 1 ms except for one reply at 7 ms. No timeout occurred, suggesting that the gateway’s MAC address was already available through ARP (Plummer, 1982).</w:t>
       </w:r>
+    </w:p>
+    <w:p>
+      <w:pPr>
+        <w:spacing w:after="120"/>
+      </w:pPr>
       <w:r>
-        <w:rPr>
-          <w:highlight w:val="yellow"/>
-        </w:rPr>
-        <w:t>confirm both</w:t>
+        <w:t>The cross-site ping from PC01 to PC100 also succeeded, with four replies and 0% packet loss. Response times were 19, 37, 2 and 1 ms. The initial delays may have been caused by ARP resolution or first-packet processing. The TTL of 126 is consistent with an initial TTL of 128 and two router hops.</w:t>
       </w:r>
+    </w:p>
+    <w:p>
+      <w:pPr>
+        <w:spacing w:after="120"/>
+      </w:pPr>
       <w:r>
-        <w:t>. Every path is the shortest available, so the OSPF costs on the equal serial links behave as intended. A successful ping from Laptop78 to the DNS server also shows that routing and name services work together.</w:t>
+        <w:t>Traceroute shows the responding router hops along the packet’s route (Kurose and Ross, 2021). PC70 to Laptop77 showed 192.70.20.33, followed by the destination, indicating routing between the Sales and IT VLANs at Wrocław. PC01 to PC100 showed 192.70.20.193, then 192.70.20.246, and finally the destination (Fig. 9), consistent with the direct Skipton–Greenwich route. One probe timed out, but subsequent probes received replies in under 1 ms.</w:t>
+      </w:r>
+    </w:p>
+    <w:p>
+      <w:pPr>
+        <w:spacing w:after="120"/>
+      </w:pPr>
+      <w:r>
+        <w:t>PC73 to PC01 showed 192.70.20.33, then 192.70.20.241, and finally the destination. PC02 to PC08 showed 192.70.20.193, followed by the destination. These results are consistent with routing between sites and VLANs. A successful ping from Laptop78 to the DNS server also supports connectivity to the server. Overall, the results support the IP addressing and routing configuration described in Section A.</w:t>
+      </w:r>
+    </w:p>
+    <w:p>
+      <w:pPr>
+        <w:spacing w:after="120"/>
+      </w:pPr>
+      <w:r>
+        <w:t>I ran the worksheet tests using the devices available in my Packet Tracer topology, with device names updated to match the assignment where applicable. The worksheet refers to PC20, which is not present in my topology, so I used the corresponding available device for the relevant test. Router3 was represented by the Greenwich router.</w:t>
       </w:r>
     </w:p>
     <w:p>

</xml_diff>

<commit_message>
Remove untested claims and placeholders from report
Co-Authored-By: Claude Sonnet 5.5 <noreply@anthropic.com>
Claude-Session: https://claude.ai/code/session_01BfWNAo3rPJrP7vU7fTtPF2
</commit_message>
<xml_diff>
--- a/SWG_Network_Report.docx
+++ b/SWG_Network_Report.docx
@@ -503,7 +503,7 @@
         <w:spacing w:after="120"/>
       </w:pPr>
       <w:r>
-        <w:t>B-ii Efficiency and resilience. Wrocław–Greenwich traffic uses the direct /30 and does not hairpin through Skipton. OSPF (process 1, area 0), a link-state protocol that picks the lowest-cost path (Moy, 1998), has FULL adjacencies on every link: Wroclaw and Greenwich each list two neighbours (Fig. 4). If one link fails, OSPF reroutes through the third router, and section D tests this. Inside each site PVST+ prevents Layer 2 loops (Odom, 2019). With one switch per site it is a safeguard rather than an active feature.</w:t>
+        <w:t>B-ii Efficiency and resilience. Skipton–Greenwich traffic uses the direct /30 and does not hairpin through Wrocław (Fig. 9). OSPF (process 1, area 0), a link-state protocol that picks the lowest-cost path (Moy, 1998), has FULL adjacencies on every link: Wroclaw and Greenwich each list two neighbours (Fig. 4). If one link fails, OSPF should reroute through the third router. I did not run a link-failure test, so this rests on the adjacencies in Fig. 4 and the protocol design, and it is a limitation of my testing. Inside each site PVST+ prevents Layer 2 loops (Odom, 2019). With one switch per site it is a safeguard rather than an active feature.</w:t>
       </w:r>
     </w:p>
     <w:p>
@@ -567,16 +567,7 @@
         <w:spacing w:after="120"/>
       </w:pPr>
       <w:r>
-        <w:t xml:space="preserve">D-i Results. I ran the worksheet ping and traceroute tests using the renamed devices in my Packet Tracer topology. The worksheet refers to PC20 and Router3; I used </w:t>
-      </w:r>
-      <w:r>
-        <w:rPr>
-          <w:highlight w:val="yellow"/>
-        </w:rPr>
-        <w:t>[actual PC name]</w:t>
-      </w:r>
-      <w:r>
-        <w:t xml:space="preserve"> as the substitute for PC20 and the Greenwich router as the substitute for Router3.</w:t>
+        <w:t>D-i Results. I ran the worksheet ping and traceroute tests using the devices in my Packet Tracer topology. The worksheet refers to PC20 and Router3, which are not present in my topology, so I used the nearest available devices instead.</w:t>
       </w:r>
     </w:p>
     <w:p>
@@ -600,15 +591,7 @@
         <w:spacing w:after="120"/>
       </w:pPr>
       <w:r>
-        <w:t>Traceroute shows the responding router hops along the packet’s route (Kurose and Ross, 2021). PC70 to Laptop77 showed 192.70.20.33, followed by the destination, indicating routing between the Sales and IT VLANs at Wrocław. PC01 to PC100 showed 192.70.20.193, then 192.70.20.246, and finally the destination (Fig. 9), consistent with the direct Skipton–Greenwich route. One probe timed out, but subsequent probes received replies in under 1 ms.</w:t>
-      </w:r>
-    </w:p>
-    <w:p>
-      <w:pPr>
-        <w:spacing w:after="120"/>
-      </w:pPr>
-      <w:r>
-        <w:t>PC73 to PC01 showed 192.70.20.33, then 192.70.20.241, and finally the destination. PC02 to PC08 showed 192.70.20.193, followed by the destination. These results are consistent with routing between sites and VLANs. A successful ping from Laptop78 to the DNS server also supports connectivity to the server. Overall, the results support the IP addressing and routing configuration described in Section A.</w:t>
+        <w:t>Traceroute shows the responding router hops along the packet’s route (Kurose and Ross, 2021). PC01 to PC100 showed 192.70.20.193, then 192.70.20.246, and finally the destination (Fig. 9), consistent with the direct Skipton–Greenwich route chosen by OSPF. One probe timed out, but subsequent probes received replies in under 1 ms. Together with the ping results, this supports the IP addressing and routing configuration described in Section A.</w:t>
       </w:r>
     </w:p>
     <w:p>
@@ -640,7 +623,7 @@
         <w:spacing w:after="120"/>
       </w:pPr>
       <w:r>
-        <w:t>Fault tolerance test. To test resilience, I shut down Serial0/1/1 on the Skipton router and repeated the traceroute from PC01 to PC100. The route changed and passed through 192.70.20.193 (Skipton HR gateway), 192.70.20.242 (Wrocław serial interface) and 192.70.20.250 (Greenwich serial interface) before reaching the destination, one hop more than the direct path. The ping still succeeded, so PC01 could reach PC100 with the direct link down (Fig. 10). OSPF removed the failed route and selected the alternative through the other routers (Moy, 1998). The cost is a longer path and higher latency, but connectivity is kept, which proves the resilience claimed in B. It tests one link failure only: a second failure, or the loss of the Wroclaw router, would still isolate a site.</w:t>
+        <w:t>Limitation of testing. I did not test a link failure, so the resilience of the triangle is shown by the two OSPF neighbours on each router (Fig. 4) and not by a failover trace. A shutdown test on one serial link, followed by a repeat traceroute, would prove it.</w:t>
       </w:r>
     </w:p>
     <w:p>
@@ -656,7 +639,7 @@
         <w:spacing w:after="120"/>
       </w:pPr>
       <w:r>
-        <w:t>E-i How the design supports SWG. A single link failure does not cut any site off, because the link-shutdown test in D rerouted through the third router. The nine department VLANs form nine separate broadcast domains, so a broadcast storm in one stays there. DNS and HTTP in Skipton IT serve every site: the browser at PC18 loaded www.coventrylab.ac.uk (Fig. 7), which also confirms inter-site routing, DNS resolution and the HTTP service together. Because each site reaches the servers through its router and the serial links, a server fault and a routing fault look different in testing, and that speeds up diagnosis. The addressing is documented and predictable, and each department has its own subnet and gateway, so a fault can be narrowed quickly to one department at one site.</w:t>
+        <w:t>E-i How the design supports SWG. A single link failure should not cut any site off, because each router has two OSPF neighbours (Fig. 4), although I did not test this. The nine department VLANs form nine separate broadcast domains, so a broadcast storm in one stays there. DNS and HTTP in Skipton IT serve every site: the browser at PC18 loaded www.coventrylab.ac.uk (Fig. 7), which confirms that DNS resolution and the HTTP service work together. Because each site reaches the servers through its router and the serial links, a server fault and a routing fault look different in testing, and that speeds up diagnosis. The addressing is documented and predictable, and each department has its own subnet and gateway, so a fault can be narrowed quickly to one department at one site.</w:t>
       </w:r>
     </w:p>
     <w:p>
@@ -688,7 +671,7 @@
         <w:spacing w:after="120"/>
       </w:pPr>
       <w:r>
-        <w:t>The design meets the brief with a 98% efficient VLSM plan, a triangle of OSPF-connected routers and basic access controls, and the tests show the direct path and the failover path. I would rate it a sound base for three small sites, not a finished enterprise design. Its weaknesses are the tight addressing, the single points of failure at each site and the lack of ACLs and encryption. The improvements in C and E address these.</w:t>
+        <w:t>The design meets the brief with a 98% efficient VLSM plan, a triangle of OSPF-connected routers and basic access controls, and the tests show the direct path between sites. I would rate it a sound base for three small sites, not a finished enterprise design. Its weaknesses are the tight addressing, the single points of failure at each site and the lack of ACLs and encryption. The improvements in C and E address these.</w:t>
       </w:r>
     </w:p>
     <w:p>
@@ -1018,7 +1001,7 @@
           <w:i/>
           <w:sz w:val="19"/>
         </w:rPr>
-        <w:t>Fig. 4: Skipton sub-interfaces and OSPF neighbour (left); Wrocław neighbours (centre); Greenwich neighbours (right). «Add show ip route with O routes for one router.»</w:t>
+        <w:t>Fig. 4: Skipton sub-interfaces and OSPF neighbour (left); Wrocław neighbours (centre); Greenwich neighbours (right).</w:t>
       </w:r>
     </w:p>
     <w:tbl>
@@ -1178,7 +1161,7 @@
           <w:i/>
           <w:sz w:val="19"/>
         </w:rPr>
-        <w:t>Fig. 6: show port-security, Greenwich switch (sticky MAC, maximum 2, restrict). «Add the Skipton or Wrocław output with learned MACs after traffic.»</w:t>
+        <w:t>Fig. 6: show port-security, Greenwich switch (sticky MAC, maximum 2, restrict).</w:t>
       </w:r>
     </w:p>
     <w:tbl>
@@ -1455,19 +1438,6 @@
     </w:p>
     <w:p>
       <w:pPr>
-        <w:spacing w:after="120"/>
-      </w:pPr>
-      <w:r/>
-      <w:r>
-        <w:rPr>
-          <w:highlight w:val="yellow"/>
-        </w:rPr>
-        <w:t>Fig. 10: insert the traceroute and successful ping captured with Serial0/1/1 shut down.</w:t>
-      </w:r>
-      <w:r/>
-    </w:p>
-    <w:p>
-      <w:pPr>
         <w:pStyle w:val="Heading1"/>
       </w:pPr>
       <w:r>
@@ -1478,15 +1448,8 @@
       <w:pPr>
         <w:spacing w:after="120"/>
       </w:pPr>
-      <w:r/>
       <w:r>
-        <w:rPr>
-          <w:highlight w:val="yellow"/>
-        </w:rPr>
-        <w:t>Edit to match what you actually did.</w:t>
-      </w:r>
-      <w:r>
-        <w:t xml:space="preserve"> I used Claude (Anthropic, 2026) to help structure and draft this report. I checked the configurations, addresses and test results against my Packet Tracer network and my worksheet, and I take responsibility for the content.</w:t>
+        <w:t>I used Claude (Anthropic, 2026) to help structure and draft this report. I checked the configurations, addresses and test results against my Packet Tracer network and my worksheet, and I take responsibility for the content.</w:t>
       </w:r>
     </w:p>
     <w:p>

</xml_diff>